<commit_message>
1, 2, and 3 (HRHG and science first proofing done)
</commit_message>
<xml_diff>
--- a/Header, potrate, nur to 3, 4.docx
+++ b/Header, potrate, nur to 3, 4.docx
@@ -513,9 +513,8 @@
           <w:sz w:val="24"/>
           <w:szCs w:val="24"/>
         </w:rPr>
-        <w:t xml:space="preserve">Time: </w:t>
-      </w:r>
-      <w:proofErr w:type="gramStart"/>
+        <w:t>Time: -</w:t>
+      </w:r>
       <w:r>
         <w:rPr>
           <w:rFonts w:ascii="Times New Roman" w:hAnsi="Times New Roman" w:cs="Times New Roman"/>
@@ -523,18 +522,8 @@
           <w:sz w:val="24"/>
           <w:szCs w:val="24"/>
         </w:rPr>
-        <w:t>-</w:t>
-      </w:r>
-      <w:r>
-        <w:rPr>
-          <w:rFonts w:ascii="Times New Roman" w:hAnsi="Times New Roman" w:cs="Times New Roman"/>
-          <w:b/>
-          <w:sz w:val="24"/>
-          <w:szCs w:val="24"/>
-        </w:rPr>
         <w:t xml:space="preserve">  hrs.</w:t>
       </w:r>
-      <w:proofErr w:type="gramEnd"/>
       <w:r>
         <w:rPr>
           <w:rFonts w:ascii="Times New Roman" w:hAnsi="Times New Roman" w:cs="Times New Roman"/>
@@ -1234,9 +1223,9 @@
           <w:sz w:val="40"/>
           <w:szCs w:val="40"/>
         </w:rPr>
-        <w:t>u|</w:t>
-      </w:r>
-      <w:proofErr w:type="gramStart"/>
+        <w:t>u|Lg</w:t>
+      </w:r>
+      <w:proofErr w:type="spellEnd"/>
       <w:r>
         <w:rPr>
           <w:rFonts w:ascii="Preeti" w:hAnsi="Preeti"/>
@@ -1245,9 +1234,8 @@
           <w:sz w:val="40"/>
           <w:szCs w:val="40"/>
         </w:rPr>
-        <w:t>Lg</w:t>
-      </w:r>
-      <w:proofErr w:type="spellEnd"/>
+        <w:t xml:space="preserve"> ;f];fO</w:t>
+      </w:r>
       <w:r>
         <w:rPr>
           <w:rFonts w:ascii="Preeti" w:hAnsi="Preeti"/>
@@ -1256,9 +1244,8 @@
           <w:sz w:val="40"/>
           <w:szCs w:val="40"/>
         </w:rPr>
-        <w:t xml:space="preserve"> ;f];fO</w:t>
-      </w:r>
-      <w:proofErr w:type="gramEnd"/>
+        <w:t>6L</w:t>
+      </w:r>
       <w:r>
         <w:rPr>
           <w:rFonts w:ascii="Preeti" w:hAnsi="Preeti"/>
@@ -1267,8 +1254,9 @@
           <w:sz w:val="40"/>
           <w:szCs w:val="40"/>
         </w:rPr>
-        <w:t>6L</w:t>
-      </w:r>
+        <w:t xml:space="preserve"> </w:t>
+      </w:r>
+      <w:proofErr w:type="spellStart"/>
       <w:r>
         <w:rPr>
           <w:rFonts w:ascii="Preeti" w:hAnsi="Preeti"/>
@@ -1277,10 +1265,9 @@
           <w:sz w:val="40"/>
           <w:szCs w:val="40"/>
         </w:rPr>
-        <w:t xml:space="preserve"> </w:t>
-      </w:r>
-      <w:proofErr w:type="spellStart"/>
-      <w:proofErr w:type="gramStart"/>
+        <w:t>klAns</w:t>
+      </w:r>
+      <w:proofErr w:type="spellEnd"/>
       <w:r>
         <w:rPr>
           <w:rFonts w:ascii="Preeti" w:hAnsi="Preeti"/>
@@ -1289,9 +1276,9 @@
           <w:sz w:val="40"/>
           <w:szCs w:val="40"/>
         </w:rPr>
-        <w:t>klAns</w:t>
-      </w:r>
-      <w:proofErr w:type="spellEnd"/>
+        <w:t xml:space="preserve"> :</w:t>
+      </w:r>
+      <w:proofErr w:type="spellStart"/>
       <w:r>
         <w:rPr>
           <w:rFonts w:ascii="Preeti" w:hAnsi="Preeti"/>
@@ -1300,108 +1287,7 @@
           <w:sz w:val="40"/>
           <w:szCs w:val="40"/>
         </w:rPr>
-        <w:t xml:space="preserve"> :</w:t>
-      </w:r>
-      <w:proofErr w:type="spellStart"/>
-      <w:r>
-        <w:rPr>
-          <w:rFonts w:ascii="Preeti" w:hAnsi="Preeti"/>
-          <w:b/>
-          <w:bCs/>
-          <w:sz w:val="40"/>
-          <w:szCs w:val="40"/>
-        </w:rPr>
         <w:t>s'n</w:t>
-      </w:r>
-      <w:proofErr w:type="spellEnd"/>
-      <w:proofErr w:type="gramEnd"/>
-    </w:p>
-    <w:p>
-      <w:pPr>
-        <w:tabs>
-          <w:tab w:val="left" w:pos="180"/>
-        </w:tabs>
-        <w:spacing w:after="0" w:line="240" w:lineRule="auto"/>
-        <w:jc w:val="center"/>
-      </w:pPr>
-      <w:r>
-        <w:rPr>
-          <w:rFonts w:ascii="Preeti" w:hAnsi="Preeti"/>
-          <w:b/>
-          <w:sz w:val="28"/>
-          <w:szCs w:val="28"/>
-        </w:rPr>
-        <w:t>/</w:t>
-      </w:r>
-      <w:proofErr w:type="spellStart"/>
-      <w:r>
-        <w:rPr>
-          <w:rFonts w:ascii="Preeti" w:hAnsi="Preeti"/>
-          <w:b/>
-          <w:sz w:val="28"/>
-          <w:szCs w:val="28"/>
-        </w:rPr>
-        <w:t>Tggu</w:t>
-      </w:r>
-      <w:proofErr w:type="spellEnd"/>
-      <w:r>
-        <w:rPr>
-          <w:rFonts w:ascii="Preeti" w:hAnsi="Preeti"/>
-          <w:b/>
-          <w:sz w:val="28"/>
-          <w:szCs w:val="28"/>
-        </w:rPr>
-        <w:t>/–&amp;</w:t>
-      </w:r>
-      <w:proofErr w:type="gramStart"/>
-      <w:r>
-        <w:rPr>
-          <w:rFonts w:ascii="Preeti" w:hAnsi="Preeti"/>
-          <w:b/>
-          <w:sz w:val="28"/>
-          <w:szCs w:val="28"/>
-        </w:rPr>
-        <w:t>, ;f</w:t>
-      </w:r>
-      <w:proofErr w:type="gramEnd"/>
-      <w:r>
-        <w:rPr>
-          <w:rFonts w:ascii="Preeti" w:hAnsi="Preeti"/>
-          <w:b/>
-          <w:sz w:val="28"/>
-          <w:szCs w:val="28"/>
-        </w:rPr>
-        <w:t>}/</w:t>
-      </w:r>
-      <w:proofErr w:type="spellStart"/>
-      <w:r>
-        <w:rPr>
-          <w:rFonts w:ascii="Preeti" w:hAnsi="Preeti"/>
-          <w:b/>
-          <w:sz w:val="28"/>
-          <w:szCs w:val="28"/>
-        </w:rPr>
-        <w:t>fxf</w:t>
-      </w:r>
-      <w:proofErr w:type="spellEnd"/>
-      <w:r>
-        <w:rPr>
-          <w:rFonts w:ascii="Preeti" w:hAnsi="Preeti"/>
-          <w:b/>
-          <w:sz w:val="28"/>
-          <w:szCs w:val="28"/>
-        </w:rPr>
-        <w:t xml:space="preserve"> </w:t>
-      </w:r>
-      <w:proofErr w:type="spellStart"/>
-      <w:r>
-        <w:rPr>
-          <w:rFonts w:ascii="Preeti" w:hAnsi="Preeti"/>
-          <w:b/>
-          <w:sz w:val="28"/>
-          <w:szCs w:val="28"/>
-        </w:rPr>
-        <w:t>lrtjg</w:t>
       </w:r>
       <w:proofErr w:type="spellEnd"/>
     </w:p>
@@ -1413,7 +1299,75 @@
         <w:spacing w:after="0" w:line="240" w:lineRule="auto"/>
         <w:jc w:val="center"/>
       </w:pPr>
-      <w:proofErr w:type="gramStart"/>
+      <w:r>
+        <w:rPr>
+          <w:rFonts w:ascii="Preeti" w:hAnsi="Preeti"/>
+          <w:b/>
+          <w:sz w:val="28"/>
+          <w:szCs w:val="28"/>
+        </w:rPr>
+        <w:t>/</w:t>
+      </w:r>
+      <w:proofErr w:type="spellStart"/>
+      <w:r>
+        <w:rPr>
+          <w:rFonts w:ascii="Preeti" w:hAnsi="Preeti"/>
+          <w:b/>
+          <w:sz w:val="28"/>
+          <w:szCs w:val="28"/>
+        </w:rPr>
+        <w:t>Tggu</w:t>
+      </w:r>
+      <w:proofErr w:type="spellEnd"/>
+      <w:r>
+        <w:rPr>
+          <w:rFonts w:ascii="Preeti" w:hAnsi="Preeti"/>
+          <w:b/>
+          <w:sz w:val="28"/>
+          <w:szCs w:val="28"/>
+        </w:rPr>
+        <w:t>/–&amp;, ;f}/</w:t>
+      </w:r>
+      <w:proofErr w:type="spellStart"/>
+      <w:r>
+        <w:rPr>
+          <w:rFonts w:ascii="Preeti" w:hAnsi="Preeti"/>
+          <w:b/>
+          <w:sz w:val="28"/>
+          <w:szCs w:val="28"/>
+        </w:rPr>
+        <w:t>fxf</w:t>
+      </w:r>
+      <w:proofErr w:type="spellEnd"/>
+      <w:r>
+        <w:rPr>
+          <w:rFonts w:ascii="Preeti" w:hAnsi="Preeti"/>
+          <w:b/>
+          <w:sz w:val="28"/>
+          <w:szCs w:val="28"/>
+        </w:rPr>
+        <w:t xml:space="preserve"> </w:t>
+      </w:r>
+      <w:proofErr w:type="spellStart"/>
+      <w:r>
+        <w:rPr>
+          <w:rFonts w:ascii="Preeti" w:hAnsi="Preeti"/>
+          <w:b/>
+          <w:sz w:val="28"/>
+          <w:szCs w:val="28"/>
+        </w:rPr>
+        <w:t>lrtjg</w:t>
+      </w:r>
+      <w:proofErr w:type="spellEnd"/>
+    </w:p>
+    <w:p>
+      <w:pPr>
+        <w:tabs>
+          <w:tab w:val="left" w:pos="180"/>
+        </w:tabs>
+        <w:spacing w:after="0" w:line="240" w:lineRule="auto"/>
+        <w:jc w:val="center"/>
+      </w:pPr>
       <w:r>
         <w:rPr>
           <w:rFonts w:ascii="Preeti" w:hAnsi="Preeti"/>
@@ -1432,9 +1386,8 @@
           <w:szCs w:val="36"/>
           <w:u w:val="single"/>
         </w:rPr>
-        <w:t>];|</w:t>
-      </w:r>
-      <w:proofErr w:type="gramEnd"/>
+        <w:t>];|f]</w:t>
+      </w:r>
       <w:r>
         <w:rPr>
           <w:rFonts w:ascii="Preeti" w:hAnsi="Preeti"/>
@@ -1443,8 +1396,9 @@
           <w:szCs w:val="36"/>
           <w:u w:val="single"/>
         </w:rPr>
-        <w:t>f]</w:t>
-      </w:r>
+        <w:t xml:space="preserve"> q}</w:t>
+      </w:r>
+      <w:proofErr w:type="spellStart"/>
       <w:r>
         <w:rPr>
           <w:rFonts w:ascii="Preeti" w:hAnsi="Preeti"/>
@@ -1453,40 +1407,7 @@
           <w:szCs w:val="36"/>
           <w:u w:val="single"/>
         </w:rPr>
-        <w:t xml:space="preserve"> </w:t>
-      </w:r>
-      <w:proofErr w:type="gramStart"/>
-      <w:r>
-        <w:rPr>
-          <w:rFonts w:ascii="Preeti" w:hAnsi="Preeti"/>
-          <w:b/>
-          <w:sz w:val="36"/>
-          <w:szCs w:val="36"/>
-          <w:u w:val="single"/>
-        </w:rPr>
-        <w:t>q}</w:t>
-      </w:r>
-      <w:proofErr w:type="spellStart"/>
-      <w:r>
-        <w:rPr>
-          <w:rFonts w:ascii="Preeti" w:hAnsi="Preeti"/>
-          <w:b/>
-          <w:sz w:val="36"/>
-          <w:szCs w:val="36"/>
-          <w:u w:val="single"/>
-        </w:rPr>
-        <w:t>dfl</w:t>
-      </w:r>
-      <w:proofErr w:type="gramEnd"/>
-      <w:r>
-        <w:rPr>
-          <w:rFonts w:ascii="Preeti" w:hAnsi="Preeti"/>
-          <w:b/>
-          <w:sz w:val="36"/>
-          <w:szCs w:val="36"/>
-          <w:u w:val="single"/>
-        </w:rPr>
-        <w:t>;s</w:t>
+        <w:t>dfl;s</w:t>
       </w:r>
       <w:proofErr w:type="spellEnd"/>
       <w:r>
@@ -1558,8 +1479,9 @@
         <w:jc w:val="both"/>
         <w:rPr>
           <w:rFonts w:ascii="Preeti" w:hAnsi="Preeti"/>
-          <w:bCs/>
-          <w:lang w:eastAsia="zh-CN" w:bidi="hi-IN"/>
+          <w:b/>
+          <w:sz w:val="32"/>
+          <w:szCs w:val="32"/>
         </w:rPr>
       </w:pPr>
       <w:proofErr w:type="spellStart"/>
@@ -1653,7 +1575,6 @@
         </w:rPr>
         <w:t xml:space="preserve">समय </w:t>
       </w:r>
-      <w:proofErr w:type="gramStart"/>
       <w:r>
         <w:rPr>
           <w:rFonts w:ascii="Preeti" w:hAnsi="Preeti"/>
@@ -1681,18 +1602,7 @@
           <w:szCs w:val="28"/>
           <w:lang w:eastAsia="zh-CN" w:bidi="hi-IN"/>
         </w:rPr>
-        <w:t>3</w:t>
-      </w:r>
-      <w:proofErr w:type="gramEnd"/>
-      <w:r>
-        <w:rPr>
-          <w:rFonts w:ascii="Preeti" w:hAnsi="Preeti"/>
-          <w:b/>
-          <w:sz w:val="28"/>
-          <w:szCs w:val="28"/>
-          <w:lang w:eastAsia="zh-CN" w:bidi="hi-IN"/>
-        </w:rPr>
-        <w:t>+=</w:t>
+        <w:t>3+=</w:t>
       </w:r>
       <w:r>
         <w:rPr>
@@ -1761,9 +1671,8 @@
           <w:sz w:val="32"/>
           <w:szCs w:val="32"/>
         </w:rPr>
-        <w:t>k"0</w:t>
-      </w:r>
-      <w:proofErr w:type="gramStart"/>
+        <w:t>k"0f</w:t>
+      </w:r>
       <w:r>
         <w:rPr>
           <w:rFonts w:ascii="Preeti" w:hAnsi="Preeti"/>
@@ -1772,17 +1681,6 @@
           <w:szCs w:val="32"/>
         </w:rPr>
         <w:t>f{</w:t>
-      </w:r>
-      <w:proofErr w:type="spellStart"/>
-      <w:proofErr w:type="gramEnd"/>
-      <w:r>
-        <w:rPr>
-          <w:rFonts w:ascii="Preeti" w:hAnsi="Preeti"/>
-          <w:b/>
-          <w:sz w:val="32"/>
-          <w:szCs w:val="32"/>
-        </w:rPr>
-        <w:t>f</w:t>
       </w:r>
       <w:r>
         <w:rPr>
@@ -1792,18 +1690,7 @@
           <w:szCs w:val="32"/>
           <w:lang w:eastAsia="zh-CN"/>
         </w:rPr>
-        <w:t>ÍM</w:t>
-      </w:r>
-      <w:proofErr w:type="spellEnd"/>
-      <w:r>
-        <w:rPr>
-          <w:rFonts w:ascii="Preeti" w:hAnsi="Preeti" w:cs="Times New Roman"/>
-          <w:b/>
-          <w:sz w:val="32"/>
-          <w:szCs w:val="32"/>
-          <w:lang w:eastAsia="zh-CN"/>
-        </w:rPr>
-        <w:t xml:space="preserve">– </w:t>
+        <w:t xml:space="preserve">ÍM– </w:t>
       </w:r>
       <w:r>
         <w:rPr>
@@ -1837,6 +1724,51 @@
         </w:rPr>
         <w:t>–</w:t>
       </w:r>
+      <w:r>
+        <w:rPr>
+          <w:rFonts w:ascii="Preeti" w:hAnsi="Preeti" w:cs="Times New Roman"/>
+          <w:b/>
+          <w:sz w:val="36"/>
+          <w:szCs w:val="36"/>
+          <w:lang w:eastAsia="zh-CN"/>
+        </w:rPr>
+        <w:t>g]</w:t>
+      </w:r>
+      <w:proofErr w:type="spellStart"/>
+      <w:r>
+        <w:rPr>
+          <w:rFonts w:ascii="Preeti" w:hAnsi="Preeti" w:cs="Times New Roman"/>
+          <w:b/>
+          <w:sz w:val="36"/>
+          <w:szCs w:val="36"/>
+          <w:lang w:eastAsia="zh-CN"/>
+        </w:rPr>
+        <w:t>kfnL</w:t>
+      </w:r>
+      <w:proofErr w:type="spellEnd"/>
+      <w:r>
+        <w:rPr>
+          <w:rFonts w:ascii="Preeti" w:hAnsi="Preeti" w:cs="Times New Roman"/>
+          <w:b/>
+          <w:sz w:val="36"/>
+          <w:szCs w:val="36"/>
+          <w:lang w:eastAsia="zh-CN"/>
+        </w:rPr>
+        <w:tab/>
+        <w:t>;</w:t>
+      </w:r>
+      <w:proofErr w:type="spellStart"/>
+      <w:r>
+        <w:rPr>
+          <w:rFonts w:ascii="Preeti" w:hAnsi="Preeti" w:cs="Times New Roman"/>
+          <w:b/>
+          <w:sz w:val="36"/>
+          <w:szCs w:val="36"/>
+          <w:lang w:eastAsia="zh-CN"/>
+        </w:rPr>
+        <w:t>fdflhs</w:t>
+      </w:r>
+      <w:proofErr w:type="spellEnd"/>
     </w:p>
     <w:tbl>
       <w:tblPr>
@@ -1888,7 +1820,6 @@
               </w:rPr>
             </w:pPr>
             <w:proofErr w:type="spellStart"/>
-            <w:proofErr w:type="gramStart"/>
             <w:r>
               <w:rPr>
                 <w:rFonts w:ascii="Preeti" w:hAnsi="Preeti"/>
@@ -1918,19 +1849,19 @@
                 <w:sz w:val="40"/>
                 <w:szCs w:val="40"/>
               </w:rPr>
-              <w:t>:</w:t>
-            </w:r>
-            <w:proofErr w:type="gramEnd"/>
-            <w:r>
-              <w:rPr>
-                <w:rFonts w:ascii="Times New Roman" w:hAnsi="Times New Roman"/>
+              <w:t xml:space="preserve">: </w:t>
+            </w:r>
+            <w:r>
+              <w:rPr>
+                <w:rFonts w:ascii="Preeti" w:hAnsi="Preeti"/>
                 <w:b/>
                 <w:bCs/>
                 <w:sz w:val="40"/>
                 <w:szCs w:val="40"/>
               </w:rPr>
-              <w:t xml:space="preserve"> </w:t>
-            </w:r>
+              <w:t>====================================================/f]n g+=============;]</w:t>
+            </w:r>
+            <w:proofErr w:type="spellStart"/>
             <w:r>
               <w:rPr>
                 <w:rFonts w:ascii="Preeti" w:hAnsi="Preeti"/>
@@ -1939,9 +1870,9 @@
                 <w:sz w:val="40"/>
                 <w:szCs w:val="40"/>
               </w:rPr>
-              <w:t>====================================================/</w:t>
-            </w:r>
-            <w:proofErr w:type="gramStart"/>
+              <w:t>S;g</w:t>
+            </w:r>
+            <w:proofErr w:type="spellEnd"/>
             <w:r>
               <w:rPr>
                 <w:rFonts w:ascii="Preeti" w:hAnsi="Preeti"/>
@@ -1950,9 +1881,18 @@
                 <w:sz w:val="40"/>
                 <w:szCs w:val="40"/>
               </w:rPr>
-              <w:t>f]n</w:t>
-            </w:r>
-            <w:proofErr w:type="gramEnd"/>
+              <w:t xml:space="preserve"> M</w:t>
+            </w:r>
+            <w:r>
+              <w:rPr>
+                <w:rFonts w:ascii="Times New Roman" w:hAnsi="Times New Roman"/>
+                <w:b/>
+                <w:bCs/>
+                <w:sz w:val="24"/>
+                <w:szCs w:val="24"/>
+              </w:rPr>
+              <w:t xml:space="preserve">  </w:t>
+            </w:r>
             <w:r>
               <w:rPr>
                 <w:rFonts w:ascii="Preeti" w:hAnsi="Preeti"/>
@@ -1961,93 +1901,7 @@
                 <w:sz w:val="40"/>
                 <w:szCs w:val="40"/>
               </w:rPr>
-              <w:t xml:space="preserve"> g+=============</w:t>
-            </w:r>
-            <w:proofErr w:type="gramStart"/>
-            <w:r>
-              <w:rPr>
-                <w:rFonts w:ascii="Preeti" w:hAnsi="Preeti"/>
-                <w:b/>
-                <w:bCs/>
-                <w:sz w:val="40"/>
-                <w:szCs w:val="40"/>
-              </w:rPr>
-              <w:t>;]</w:t>
-            </w:r>
-            <w:proofErr w:type="spellStart"/>
-            <w:r>
-              <w:rPr>
-                <w:rFonts w:ascii="Preeti" w:hAnsi="Preeti"/>
-                <w:b/>
-                <w:bCs/>
-                <w:sz w:val="40"/>
-                <w:szCs w:val="40"/>
-              </w:rPr>
-              <w:t>S</w:t>
-            </w:r>
-            <w:proofErr w:type="gramEnd"/>
-            <w:r>
-              <w:rPr>
-                <w:rFonts w:ascii="Preeti" w:hAnsi="Preeti"/>
-                <w:b/>
-                <w:bCs/>
-                <w:sz w:val="40"/>
-                <w:szCs w:val="40"/>
-              </w:rPr>
-              <w:t>;g</w:t>
-            </w:r>
-            <w:proofErr w:type="spellEnd"/>
-            <w:r>
-              <w:rPr>
-                <w:rFonts w:ascii="Preeti" w:hAnsi="Preeti"/>
-                <w:b/>
-                <w:bCs/>
-                <w:sz w:val="40"/>
-                <w:szCs w:val="40"/>
-              </w:rPr>
-              <w:t xml:space="preserve"> </w:t>
-            </w:r>
-            <w:proofErr w:type="gramStart"/>
-            <w:r>
-              <w:rPr>
-                <w:rFonts w:ascii="Preeti" w:hAnsi="Preeti"/>
-                <w:b/>
-                <w:bCs/>
-                <w:sz w:val="40"/>
-                <w:szCs w:val="40"/>
-              </w:rPr>
-              <w:t>M</w:t>
-            </w:r>
-            <w:r>
-              <w:rPr>
-                <w:rFonts w:ascii="Times New Roman" w:hAnsi="Times New Roman"/>
-                <w:b/>
-                <w:bCs/>
-                <w:sz w:val="24"/>
-                <w:szCs w:val="24"/>
-              </w:rPr>
-              <w:t xml:space="preserve">  </w:t>
-            </w:r>
-            <w:r>
-              <w:rPr>
-                <w:rFonts w:ascii="Preeti" w:hAnsi="Preeti"/>
-                <w:b/>
-                <w:bCs/>
-                <w:sz w:val="40"/>
-                <w:szCs w:val="40"/>
-              </w:rPr>
-              <w:t>=</w:t>
-            </w:r>
-            <w:proofErr w:type="gramEnd"/>
-            <w:r>
-              <w:rPr>
-                <w:rFonts w:ascii="Preeti" w:hAnsi="Preeti"/>
-                <w:b/>
-                <w:bCs/>
-                <w:sz w:val="40"/>
-                <w:szCs w:val="40"/>
-              </w:rPr>
-              <w:t>===============</w:t>
+              <w:t>================</w:t>
             </w:r>
             <w:r>
               <w:rPr>
@@ -2216,18 +2070,7 @@
                 <w:sz w:val="36"/>
                 <w:szCs w:val="36"/>
               </w:rPr>
-              <w:t>k|</w:t>
-            </w:r>
-            <w:proofErr w:type="gramStart"/>
-            <w:r>
-              <w:rPr>
-                <w:rFonts w:ascii="Preeti" w:hAnsi="Preeti"/>
-                <w:b/>
-                <w:bCs/>
-                <w:sz w:val="36"/>
-                <w:szCs w:val="36"/>
-              </w:rPr>
-              <w:t>fKtf</w:t>
+              <w:t>k|fKtf</w:t>
             </w:r>
             <w:r>
               <w:rPr>
@@ -2258,7 +2101,6 @@
               </w:rPr>
               <w:t>:</w:t>
             </w:r>
-            <w:proofErr w:type="gramEnd"/>
           </w:p>
           <w:p>
             <w:pPr>
@@ -2306,7 +2148,6 @@
               <w:t>LIfssf</w:t>
             </w:r>
             <w:proofErr w:type="spellEnd"/>
-            <w:proofErr w:type="gramStart"/>
             <w:r>
               <w:rPr>
                 <w:rFonts w:ascii="Preeti" w:hAnsi="Preeti"/>
@@ -2315,30 +2156,30 @@
                 <w:sz w:val="32"/>
                 <w:szCs w:val="32"/>
               </w:rPr>
-              <w:t>] ;xL</w:t>
-            </w:r>
-            <w:proofErr w:type="gramEnd"/>
-            <w:r>
-              <w:rPr>
-                <w:rFonts w:ascii="Times New Roman" w:hAnsi="Times New Roman"/>
+              <w:t>] ;</w:t>
+            </w:r>
+            <w:proofErr w:type="spellStart"/>
+            <w:r>
+              <w:rPr>
+                <w:rFonts w:ascii="Preeti" w:hAnsi="Preeti"/>
                 <w:b/>
                 <w:bCs/>
                 <w:sz w:val="32"/>
                 <w:szCs w:val="32"/>
               </w:rPr>
-              <w:t xml:space="preserve">                        </w:t>
-            </w:r>
-            <w:r>
-              <w:rPr>
-                <w:rFonts w:ascii="Preeti" w:hAnsi="Preeti"/>
+              <w:t>xL</w:t>
+            </w:r>
+            <w:proofErr w:type="spellEnd"/>
+            <w:r>
+              <w:rPr>
+                <w:rFonts w:ascii="Times New Roman" w:hAnsi="Times New Roman"/>
                 <w:b/>
                 <w:bCs/>
                 <w:sz w:val="32"/>
                 <w:szCs w:val="32"/>
               </w:rPr>
-              <w:t>k/</w:t>
-            </w:r>
-            <w:proofErr w:type="spellStart"/>
+              <w:t xml:space="preserve">                        </w:t>
+            </w:r>
             <w:r>
               <w:rPr>
                 <w:rFonts w:ascii="Preeti" w:hAnsi="Preeti"/>
@@ -2347,10 +2188,9 @@
                 <w:sz w:val="32"/>
                 <w:szCs w:val="32"/>
               </w:rPr>
-              <w:t>LIfssf</w:t>
-            </w:r>
-            <w:proofErr w:type="spellEnd"/>
-            <w:proofErr w:type="gramStart"/>
+              <w:t>k/</w:t>
+            </w:r>
+            <w:proofErr w:type="spellStart"/>
             <w:r>
               <w:rPr>
                 <w:rFonts w:ascii="Preeti" w:hAnsi="Preeti"/>
@@ -2359,9 +2199,9 @@
                 <w:sz w:val="32"/>
                 <w:szCs w:val="32"/>
               </w:rPr>
-              <w:t>] ;</w:t>
-            </w:r>
-            <w:proofErr w:type="spellStart"/>
+              <w:t>LIfssf</w:t>
+            </w:r>
+            <w:proofErr w:type="spellEnd"/>
             <w:r>
               <w:rPr>
                 <w:rFonts w:ascii="Preeti" w:hAnsi="Preeti"/>
@@ -2370,10 +2210,20 @@
                 <w:sz w:val="32"/>
                 <w:szCs w:val="32"/>
               </w:rPr>
+              <w:t>] ;</w:t>
+            </w:r>
+            <w:proofErr w:type="spellStart"/>
+            <w:r>
+              <w:rPr>
+                <w:rFonts w:ascii="Preeti" w:hAnsi="Preeti"/>
+                <w:b/>
+                <w:bCs/>
+                <w:sz w:val="32"/>
+                <w:szCs w:val="32"/>
+              </w:rPr>
               <w:t>xL</w:t>
             </w:r>
             <w:proofErr w:type="spellEnd"/>
-            <w:proofErr w:type="gramEnd"/>
             <w:r>
               <w:rPr>
                 <w:rFonts w:ascii="Times New Roman" w:hAnsi="Times New Roman"/>
@@ -2808,7 +2658,6 @@
   <w:style w:type="character" w:default="1" w:styleId="DefaultParagraphFont">
     <w:name w:val="Default Paragraph Font"/>
     <w:uiPriority w:val="1"/>
-    <w:semiHidden/>
     <w:unhideWhenUsed/>
   </w:style>
   <w:style w:type="table" w:default="1" w:styleId="TableNormal">

</xml_diff>